<commit_message>
fix(smb-31): describe the control message's open installments truthfully
Review data-cluster-4.md NIT 1. On 24 March 2026 co-132 carries three
open SMB-18 rows (installments 2, 3 and 4, per T-J11), but the control
message called only two of them "open" and described the third as
merely "falls due". Reworded to state three installments open, two of
them past their due date, listing all three with their due date and
amount. The three $5,362.50 figures and the money census are unchanged.

Rebuilt msg-ldb-03.docx. validate SMB-31 stays PASS on all five
features, no allowlist entry; the drafted screen (34 tests) stays green.

Co-Authored-By: Claude Sonnet 5 <noreply@anthropic.com>
</commit_message>
<xml_diff>
--- a/artifacts/SMB-31/build/msg-ldb-03.docx
+++ b/artifacts/SMB-31/build/msg-ldb-03.docx
@@ -104,7 +104,7 @@
         <w:pStyle w:val="BodyText"/>
       </w:pPr>
       <w:r>
-        <w:t xml:space="preserve">The first installment on the plan was received, with thanks. As of today, two installments are open, each shown with its due date and amount:</w:t>
+        <w:t xml:space="preserve">The first installment on the plan was received, with thanks. As of today, three installments are open on the plan, two of them past their due date, each shown below with its due date and amount:</w:t>
       </w:r>
     </w:p>
     <w:p>
@@ -116,7 +116,7 @@
         </w:numPr>
       </w:pPr>
       <w:r>
-        <w:t xml:space="preserve">the second installment of $5,362.50, due 13 March 2026</w:t>
+        <w:t xml:space="preserve">the second installment of $5,362.50, due 13 March 2026, past due</w:t>
       </w:r>
     </w:p>
     <w:p>
@@ -128,20 +128,24 @@
         </w:numPr>
       </w:pPr>
       <w:r>
-        <w:t xml:space="preserve">the third installment of $5,362.50, due 20 March 2026</w:t>
+        <w:t xml:space="preserve">the third installment of $5,362.50, due 20 March 2026, past due</w:t>
+      </w:r>
+    </w:p>
+    <w:p>
+      <w:pPr>
+        <w:pStyle w:val="Compact"/>
+        <w:numPr>
+          <w:ilvl w:val="0"/>
+          <w:numId w:val="1001"/>
+        </w:numPr>
+      </w:pPr>
+      <w:r>
+        <w:t xml:space="preserve">the fourth installment of $5,362.50, due 27 March 2026</w:t>
       </w:r>
     </w:p>
     <w:p>
       <w:pPr>
         <w:pStyle w:val="FirstParagraph"/>
-      </w:pPr>
-      <w:r>
-        <w:t xml:space="preserve">The fourth installment of $5,362.50 falls due on 27 March 2026.</w:t>
-      </w:r>
-    </w:p>
-    <w:p>
-      <w:pPr>
-        <w:pStyle w:val="BodyText"/>
       </w:pPr>
       <w:r>
         <w:t xml:space="preserve">If anything has changed on your side, please reply to this email and let me know, so we can talk it through.</w:t>

</xml_diff>